<commit_message>
Add front-matter lists, appendices B & C, and banded table style
Report template:
- Enable List of Figures (lof) and List of Tables (lot) in the docx front
  matter, alongside the existing TOC.
- Move the per-hole field log out of Results into a new Appendix B —
  Per-Hole Field Logs; Methods now points to it.
- Add Appendix C — Photo Log, driven by a photo_manifest CSV param
  (file, caption columns), with a placeholder until a manifest is supplied.
- Mark appendices {.unnumbered} so they read "Appendix A/B/C" rather than
  picking up section numbers; fix the overview caption (A–I).

report_style.docx:
- Restyle the Table style: green header row (white bold), alternating
  light-green / transparent body banding, horizontal-only row borders
  (no column rules).

Co-Authored-By: Claude Opus 4.8 <noreply@anthropic.com>
</commit_message>
<xml_diff>
--- a/reports/report_style.docx
+++ b/reports/report_style.docx
@@ -2069,21 +2069,36 @@
     <w:unhideWhenUsed/>
     <w:qFormat/>
     <w:tblPr>
+      <w:tblStyleRowBandSize w:val="1"/>
       <w:tblInd w:w="0" w:type="dxa"/>
+      <w:tblBorders>
+        <w:top w:val="single" w:sz="4" w:space="0" w:color="auto"/>
+        <w:bottom w:val="single" w:sz="4" w:space="0" w:color="auto"/>
+        <w:insideH w:val="single" w:sz="4" w:space="0" w:color="auto"/>
+      </w:tblBorders>
       <w:tblCellMar>
-        <w:top w:w="0" w:type="dxa"/>
+        <w:top w:w="20" w:type="dxa"/>
         <w:left w:w="108" w:type="dxa"/>
-        <w:bottom w:w="0" w:type="dxa"/>
+        <w:bottom w:w="20" w:type="dxa"/>
         <w:right w:w="108" w:type="dxa"/>
       </w:tblCellMar>
     </w:tblPr>
     <w:tblStylePr w:type="firstRow">
-      <w:tblPr/>
+      <w:rPr>
+        <w:b/>
+        <w:color w:val="FFFFFF"/>
+      </w:rPr>
       <w:tcPr>
         <w:tcBorders>
-          <w:bottom w:val="single" w:sz="0" w:space="0" w:color="auto"/>
+          <w:bottom w:val="single" w:sz="4" w:space="0" w:color="auto"/>
         </w:tcBorders>
+        <w:shd w:val="clear" w:color="auto" w:fill="4EA72E" w:themeFill="accent6"/>
         <w:vAlign w:val="bottom"/>
+      </w:tcPr>
+    </w:tblStylePr>
+    <w:tblStylePr w:type="band2Horz">
+      <w:tcPr>
+        <w:shd w:val="clear" w:color="auto" w:fill="C6E0B4"/>
       </w:tcPr>
     </w:tblStylePr>
   </w:style>

</xml_diff>

<commit_message>
Add banded table style and Table Note style to report_style.docx
Restyle the Table style to a green-banded look (green header row, alternating
light-green/transparent body rows, horizontal-only borders), and add a
"Table Note" paragraph style (small italic grey) for footnote-style notes
beneath tables.

Co-Authored-By: Claude Opus 4.8 <noreply@anthropic.com>
</commit_message>
<xml_diff>
--- a/reports/report_style.docx
+++ b/reports/report_style.docx
@@ -2793,6 +2793,20 @@
       <w:sz w:val="18"/>
       <w:szCs w:val="18"/>
       <w:lang w:val="en-CA"/>
+    </w:rPr>
+  </w:style>
+  <w:style w:type="paragraph" w:customStyle="1" w:styleId="TableNote">
+    <w:name w:val="Table Note"/>
+    <w:basedOn w:val="Normal"/>
+    <w:qFormat/>
+    <w:pPr>
+      <w:spacing w:before="40" w:after="160"/>
+    </w:pPr>
+    <w:rPr>
+      <w:i/>
+      <w:color w:val="595959"/>
+      <w:sz w:val="16"/>
+      <w:szCs w:val="16"/>
     </w:rPr>
   </w:style>
 </w:styles>

</xml_diff>